<commit_message>
Alinear variables en codigo informe y documentacion con 10 variables independientes sin dependencias lineales
</commit_message>
<xml_diff>
--- a/03_Informe/Proyecto1_Grupo5.docx
+++ b/03_Informe/Proyecto1_Grupo5.docx
@@ -1,6 +1,6 @@
 
 <file path=word/document.xml><?xml version="1.0" encoding="utf-8"?>
-<w:document xmlns:wpc="http://schemas.microsoft.com/office/word/2010/wordprocessingCanvas" xmlns:cx="http://schemas.microsoft.com/office/drawing/2014/chartex" xmlns:cx1="http://schemas.microsoft.com/office/drawing/2015/9/8/chartex" xmlns:cx2="http://schemas.microsoft.com/office/drawing/2015/10/21/chartex" xmlns:cx3="http://schemas.microsoft.com/office/drawing/2016/5/9/chartex" xmlns:cx4="http://schemas.microsoft.com/office/drawing/2016/5/10/chartex" xmlns:cx5="http://schemas.microsoft.com/office/drawing/2016/5/11/chartex" xmlns:cx6="http://schemas.microsoft.com/office/drawing/2016/5/12/chartex" xmlns:cx7="http://schemas.microsoft.com/office/drawing/2016/5/13/chartex" xmlns:cx8="http://schemas.microsoft.com/office/drawing/2016/5/14/chartex" xmlns:mc="http://schemas.openxmlformats.org/markup-compatibility/2006" xmlns:aink="http://schemas.microsoft.com/office/drawing/2016/ink" xmlns:am3d="http://schemas.microsoft.com/office/drawing/2017/model3d" xmlns:o="urn:schemas-microsoft-com:office:office" xmlns:r="http://schemas.openxmlformats.org/officeDocument/2006/relationships" xmlns:m="http://schemas.openxmlformats.org/officeDocument/2006/math" xmlns:v="urn:schemas-microsoft-com:vml" xmlns:wp14="http://schemas.microsoft.com/office/word/2010/wordprocessingDrawing" xmlns:wp="http://schemas.openxmlformats.org/drawingml/2006/wordprocessingDrawing" xmlns:w10="urn:schemas-microsoft-com:office:word" xmlns:w="http://schemas.openxmlformats.org/wordprocessingml/2006/main" xmlns:w14="http://schemas.microsoft.com/office/word/2010/wordml" xmlns:w15="http://schemas.microsoft.com/office/word/2012/wordml" xmlns:w16cex="http://schemas.microsoft.com/office/word/2018/wordml/cex" xmlns:w16cid="http://schemas.microsoft.com/office/word/2016/wordml/cid" xmlns:w16="http://schemas.microsoft.com/office/word/2018/wordml" xmlns:w16sdtdh="http://schemas.microsoft.com/office/word/2020/wordml/sdtdatahash" xmlns:w16se="http://schemas.microsoft.com/office/word/2015/wordml/symex" xmlns:wpg="http://schemas.microsoft.com/office/word/2010/wordprocessingGroup" xmlns:wpi="http://schemas.microsoft.com/office/word/2010/wordprocessingInk" xmlns:wne="http://schemas.microsoft.com/office/word/2006/wordml" xmlns:wps="http://schemas.microsoft.com/office/word/2010/wordprocessingShape" mc:Ignorable="w14 w15 w16se w16cid w16 w16cex w16sdtdh wp14">
+<w:document xmlns:ns1="http://schemas.openxmlformats.org/markup-compatibility/2006" xmlns:ns10="urn:schemas-microsoft-com:vml" xmlns:ns11="urn:schemas-microsoft-com:office:office" xmlns:ns12="urn:schemas-microsoft-com:office:word" xmlns:ns3="http://schemas.openxmlformats.org/drawingml/2006/wordprocessingDrawing" xmlns:ns4="http://schemas.microsoft.com/office/word/2010/wordprocessingDrawing" xmlns:ns5="http://schemas.openxmlformats.org/drawingml/2006/main" xmlns:ns6="http://schemas.openxmlformats.org/drawingml/2006/picture" xmlns:ns7="http://schemas.openxmlformats.org/officeDocument/2006/relationships" xmlns:ns8="http://schemas.microsoft.com/office/drawing/2010/main" xmlns:ns9="http://schemas.microsoft.com/office/word/2010/wordprocessingShape" xmlns:w="http://schemas.openxmlformats.org/wordprocessingml/2006/main" xmlns:w14="http://schemas.microsoft.com/office/word/2010/wordml" ns1:Ignorable="w14 w15 w16se w16cid w16 w16cex w16sdtdh wp14">
   <w:body>
     <w:bookmarkStart w:id="0" w:name="_Hlk514593479" w:displacedByCustomXml="next"/>
     <w:sdt>
@@ -40,56 +40,56 @@
               <w:color w:val="4472C4" w:themeColor="accent1"/>
             </w:rPr>
             <w:drawing>
-              <wp:inline distT="0" distB="0" distL="0" distR="0" wp14:anchorId="2B929ABA" wp14:editId="324692D6">
-                <wp:extent cx="1417320" cy="750898"/>
-                <wp:effectExtent l="0" t="0" r="0" b="0"/>
-                <wp:docPr id="143" name="Imagen 144"/>
-                <wp:cNvGraphicFramePr>
-                  <a:graphicFrameLocks xmlns:a="http://schemas.openxmlformats.org/drawingml/2006/main" noChangeAspect="1"/>
-                </wp:cNvGraphicFramePr>
-                <a:graphic xmlns:a="http://schemas.openxmlformats.org/drawingml/2006/main">
-                  <a:graphicData uri="http://schemas.openxmlformats.org/drawingml/2006/picture">
-                    <pic:pic xmlns:pic="http://schemas.openxmlformats.org/drawingml/2006/picture">
-                      <pic:nvPicPr>
-                        <pic:cNvPr id="3" name="t55.png"/>
-                        <pic:cNvPicPr/>
-                      </pic:nvPicPr>
-                      <pic:blipFill>
-                        <a:blip r:embed="rId8" cstate="print">
-                          <a:duotone>
-                            <a:schemeClr val="accent1">
-                              <a:shade val="45000"/>
-                              <a:satMod val="135000"/>
-                            </a:schemeClr>
-                            <a:prstClr val="white"/>
-                          </a:duotone>
-                          <a:extLst>
-                            <a:ext uri="{28A0092B-C50C-407E-A947-70E740481C1C}">
-                              <a14:useLocalDpi xmlns:a14="http://schemas.microsoft.com/office/drawing/2010/main" val="0"/>
-                            </a:ext>
-                          </a:extLst>
-                        </a:blip>
-                        <a:stretch>
-                          <a:fillRect/>
-                        </a:stretch>
-                      </pic:blipFill>
-                      <pic:spPr>
-                        <a:xfrm>
-                          <a:off x="0" y="0"/>
-                          <a:ext cx="1417320" cy="750898"/>
-                        </a:xfrm>
-                        <a:prstGeom prst="rect">
-                          <a:avLst/>
-                        </a:prstGeom>
-                        <a:noFill/>
-                        <a:ln>
-                          <a:noFill/>
-                        </a:ln>
-                      </pic:spPr>
-                    </pic:pic>
-                  </a:graphicData>
-                </a:graphic>
-              </wp:inline>
+              <ns3:inline distT="0" distB="0" distL="0" distR="0" ns4:anchorId="2B929ABA" ns4:editId="324692D6">
+                <ns3:extent cx="1417320" cy="750898"/>
+                <ns3:effectExtent l="0" t="0" r="0" b="0"/>
+                <ns3:docPr id="143" name="Imagen 144"/>
+                <ns3:cNvGraphicFramePr>
+                  <ns5:graphicFrameLocks noChangeAspect="1"/>
+                </ns3:cNvGraphicFramePr>
+                <ns5:graphic>
+                  <ns5:graphicData uri="http://schemas.openxmlformats.org/drawingml/2006/picture">
+                    <ns6:pic>
+                      <ns6:nvPicPr>
+                        <ns6:cNvPr id="3" name="t55.png"/>
+                        <ns6:cNvPicPr/>
+                      </ns6:nvPicPr>
+                      <ns6:blipFill>
+                        <ns5:blip ns7:embed="rId8" cstate="print">
+                          <ns5:duotone>
+                            <ns5:schemeClr val="accent1">
+                              <ns5:shade val="45000"/>
+                              <ns5:satMod val="135000"/>
+                            </ns5:schemeClr>
+                            <ns5:prstClr val="white"/>
+                          </ns5:duotone>
+                          <ns5:extLst>
+                            <ns5:ext uri="{28A0092B-C50C-407E-A947-70E740481C1C}">
+                              <ns8:useLocalDpi val="0"/>
+                            </ns5:ext>
+                          </ns5:extLst>
+                        </ns5:blip>
+                        <ns5:stretch>
+                          <ns5:fillRect/>
+                        </ns5:stretch>
+                      </ns6:blipFill>
+                      <ns6:spPr>
+                        <ns5:xfrm>
+                          <ns5:off x="0" y="0"/>
+                          <ns5:ext cx="1417320" cy="750898"/>
+                        </ns5:xfrm>
+                        <ns5:prstGeom prst="rect">
+                          <ns5:avLst/>
+                        </ns5:prstGeom>
+                        <ns5:noFill/>
+                        <ns5:ln>
+                          <ns5:noFill/>
+                        </ns5:ln>
+                      </ns6:spPr>
+                    </ns6:pic>
+                  </ns5:graphicData>
+                </ns5:graphic>
+              </ns3:inline>
             </w:drawing>
           </w:r>
         </w:p>
@@ -201,64 +201,64 @@
               <w:noProof/>
               <w:color w:val="4472C4" w:themeColor="accent1"/>
             </w:rPr>
-            <mc:AlternateContent>
-              <mc:Choice Requires="wps">
+            <ns1:AlternateContent>
+              <ns1:Choice Requires="wps">
                 <w:drawing>
-                  <wp:anchor distT="0" distB="0" distL="114300" distR="114300" simplePos="0" relativeHeight="251659264" behindDoc="0" locked="0" layoutInCell="1" allowOverlap="1" wp14:anchorId="587BD73C" wp14:editId="2B988D04">
-                    <wp:simplePos x="0" y="0"/>
-                    <wp:positionH relativeFrom="margin">
-                      <wp:align>center</wp:align>
-                    </wp:positionH>
-                    <mc:AlternateContent>
-                      <mc:Choice Requires="wp14">
-                        <wp:positionV relativeFrom="page">
-                          <wp14:pctPosVOffset>85000</wp14:pctPosVOffset>
-                        </wp:positionV>
-                      </mc:Choice>
-                      <mc:Fallback>
-                        <wp:positionV relativeFrom="page">
-                          <wp:posOffset>9088120</wp:posOffset>
-                        </wp:positionV>
-                      </mc:Fallback>
-                    </mc:AlternateContent>
-                    <wp:extent cx="6553200" cy="557784"/>
-                    <wp:effectExtent l="0" t="0" r="0" b="12700"/>
-                    <wp:wrapNone/>
-                    <wp:docPr id="142" name="Cuadro de texto 146"/>
-                    <wp:cNvGraphicFramePr/>
-                    <a:graphic xmlns:a="http://schemas.openxmlformats.org/drawingml/2006/main">
-                      <a:graphicData uri="http://schemas.microsoft.com/office/word/2010/wordprocessingShape">
-                        <wps:wsp>
-                          <wps:cNvSpPr txBox="1"/>
-                          <wps:spPr>
-                            <a:xfrm>
-                              <a:off x="0" y="0"/>
-                              <a:ext cx="6553200" cy="557784"/>
-                            </a:xfrm>
-                            <a:prstGeom prst="rect">
-                              <a:avLst/>
-                            </a:prstGeom>
-                            <a:noFill/>
-                            <a:ln w="6350">
-                              <a:noFill/>
-                            </a:ln>
-                            <a:effectLst/>
-                          </wps:spPr>
-                          <wps:style>
-                            <a:lnRef idx="0">
-                              <a:schemeClr val="accent1"/>
-                            </a:lnRef>
-                            <a:fillRef idx="0">
-                              <a:schemeClr val="accent1"/>
-                            </a:fillRef>
-                            <a:effectRef idx="0">
-                              <a:schemeClr val="accent1"/>
-                            </a:effectRef>
-                            <a:fontRef idx="minor">
-                              <a:schemeClr val="dk1"/>
-                            </a:fontRef>
-                          </wps:style>
-                          <wps:txbx>
+                  <ns3:anchor distT="0" distB="0" distL="114300" distR="114300" simplePos="0" relativeHeight="251659264" behindDoc="0" locked="0" layoutInCell="1" allowOverlap="1" ns4:anchorId="587BD73C" ns4:editId="2B988D04">
+                    <ns3:simplePos x="0" y="0"/>
+                    <ns3:positionH relativeFrom="margin">
+                      <ns3:align>center</ns3:align>
+                    </ns3:positionH>
+                    <ns1:AlternateContent>
+                      <ns1:Choice Requires="wp14">
+                        <ns3:positionV relativeFrom="page">
+                          <ns4:pctPosVOffset>85000</ns4:pctPosVOffset>
+                        </ns3:positionV>
+                      </ns1:Choice>
+                      <ns1:Fallback>
+                        <ns3:positionV relativeFrom="page">
+                          <ns3:posOffset>9088120</ns3:posOffset>
+                        </ns3:positionV>
+                      </ns1:Fallback>
+                    </ns1:AlternateContent>
+                    <ns3:extent cx="6553200" cy="557784"/>
+                    <ns3:effectExtent l="0" t="0" r="0" b="12700"/>
+                    <ns3:wrapNone/>
+                    <ns3:docPr id="142" name="Cuadro de texto 146"/>
+                    <ns3:cNvGraphicFramePr/>
+                    <ns5:graphic>
+                      <ns5:graphicData uri="http://schemas.microsoft.com/office/word/2010/wordprocessingShape">
+                        <ns9:wsp>
+                          <ns9:cNvSpPr txBox="1"/>
+                          <ns9:spPr>
+                            <ns5:xfrm>
+                              <ns5:off x="0" y="0"/>
+                              <ns5:ext cx="6553200" cy="557784"/>
+                            </ns5:xfrm>
+                            <ns5:prstGeom prst="rect">
+                              <ns5:avLst/>
+                            </ns5:prstGeom>
+                            <ns5:noFill/>
+                            <ns5:ln w="6350">
+                              <ns5:noFill/>
+                            </ns5:ln>
+                            <ns5:effectLst/>
+                          </ns9:spPr>
+                          <ns9:style>
+                            <ns5:lnRef idx="0">
+                              <ns5:schemeClr val="accent1"/>
+                            </ns5:lnRef>
+                            <ns5:fillRef idx="0">
+                              <ns5:schemeClr val="accent1"/>
+                            </ns5:fillRef>
+                            <ns5:effectRef idx="0">
+                              <ns5:schemeClr val="accent1"/>
+                            </ns5:effectRef>
+                            <ns5:fontRef idx="minor">
+                              <ns5:schemeClr val="dk1"/>
+                            </ns5:fontRef>
+                          </ns9:style>
+                          <ns9:txbx>
                             <w:txbxContent>
                               <w:p>
                                 <w:pPr>
@@ -291,33 +291,33 @@
                                 </w:r>
                               </w:p>
                             </w:txbxContent>
-                          </wps:txbx>
-                          <wps:bodyPr rot="0" spcFirstLastPara="0" vertOverflow="overflow" horzOverflow="overflow" vert="horz" wrap="square" lIns="0" tIns="0" rIns="0" bIns="0" numCol="1" spcCol="0" rtlCol="0" fromWordArt="0" anchor="b" anchorCtr="0" forceAA="0" compatLnSpc="1">
-                            <a:prstTxWarp prst="textNoShape">
-                              <a:avLst/>
-                            </a:prstTxWarp>
-                            <a:spAutoFit/>
-                          </wps:bodyPr>
-                        </wps:wsp>
-                      </a:graphicData>
-                    </a:graphic>
-                    <wp14:sizeRelH relativeFrom="margin">
-                      <wp14:pctWidth>100000</wp14:pctWidth>
-                    </wp14:sizeRelH>
-                    <wp14:sizeRelV relativeFrom="margin">
-                      <wp14:pctHeight>0</wp14:pctHeight>
-                    </wp14:sizeRelV>
-                  </wp:anchor>
+                          </ns9:txbx>
+                          <ns9:bodyPr rot="0" spcFirstLastPara="0" vertOverflow="overflow" horzOverflow="overflow" vert="horz" wrap="square" lIns="0" tIns="0" rIns="0" bIns="0" numCol="1" spcCol="0" rtlCol="0" fromWordArt="0" anchor="b" anchorCtr="0" forceAA="0" compatLnSpc="1">
+                            <ns5:prstTxWarp prst="textNoShape">
+                              <ns5:avLst/>
+                            </ns5:prstTxWarp>
+                            <ns5:spAutoFit/>
+                          </ns9:bodyPr>
+                        </ns9:wsp>
+                      </ns5:graphicData>
+                    </ns5:graphic>
+                    <ns4:sizeRelH relativeFrom="margin">
+                      <ns4:pctWidth>100000</ns4:pctWidth>
+                    </ns4:sizeRelH>
+                    <ns4:sizeRelV relativeFrom="margin">
+                      <ns4:pctHeight>0</ns4:pctHeight>
+                    </ns4:sizeRelV>
+                  </ns3:anchor>
                 </w:drawing>
-              </mc:Choice>
-              <mc:Fallback>
+              </ns1:Choice>
+              <ns1:Fallback>
                 <w:pict>
-                  <v:shapetype w14:anchorId="587BD73C" id="_x0000_t202" coordsize="21600,21600" o:spt="202" path="m,l,21600r21600,l21600,xe">
-                    <v:stroke joinstyle="miter"/>
-                    <v:path gradientshapeok="t" o:connecttype="rect"/>
-                  </v:shapetype>
-                  <v:shape id="Cuadro de texto 146" o:spid="_x0000_s1026" type="#_x0000_t202" style="position:absolute;left:0;text-align:left;margin-left:0;margin-top:0;width:516pt;height:43.9pt;z-index:251659264;visibility:visible;mso-wrap-style:square;mso-width-percent:1000;mso-height-percent:0;mso-top-percent:850;mso-wrap-distance-left:9pt;mso-wrap-distance-top:0;mso-wrap-distance-right:9pt;mso-wrap-distance-bottom:0;mso-position-horizontal:center;mso-position-horizontal-relative:margin;mso-position-vertical-relative:page;mso-width-percent:1000;mso-height-percent:0;mso-top-percent:850;mso-width-relative:margin;mso-height-relative:margin;v-text-anchor:bottom" o:gfxdata="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" filled="f" stroked="f" strokeweight=".5pt">
-                    <v:textbox style="mso-fit-shape-to-text:t" inset="0,0,0,0">
+                  <ns10:shapetype w14:anchorId="587BD73C" id="_x0000_t202" coordsize="21600,21600" ns11:spt="202" path="m,l,21600r21600,l21600,xe">
+                    <ns10:stroke joinstyle="miter"/>
+                    <ns10:path gradientshapeok="t" ns11:connecttype="rect"/>
+                  </ns10:shapetype>
+                  <ns10:shape id="Cuadro de texto 146" ns11:spid="_x0000_s1026" type="#_x0000_t202" style="position:absolute;left:0;text-align:left;margin-left:0;margin-top:0;width:516pt;height:43.9pt;z-index:251659264;visibility:visible;mso-wrap-style:square;mso-width-percent:1000;mso-height-percent:0;mso-top-percent:850;mso-wrap-distance-left:9pt;mso-wrap-distance-top:0;mso-wrap-distance-right:9pt;mso-wrap-distance-bottom:0;mso-position-horizontal:center;mso-position-horizontal-relative:margin;mso-position-vertical-relative:page;mso-width-percent:1000;mso-height-percent:0;mso-top-percent:850;mso-width-relative:margin;mso-height-relative:margin;v-text-anchor:bottom" ns11:gfxdata="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" filled="f" stroked="f" strokeweight=".5pt">
+                    <ns10:textbox style="mso-fit-shape-to-text:t" inset="0,0,0,0">
                       <w:txbxContent>
                         <w:p>
                           <w:pPr>
@@ -350,12 +350,12 @@
                           </w:r>
                         </w:p>
                       </w:txbxContent>
-                    </v:textbox>
-                    <w10:wrap anchorx="margin" anchory="page"/>
-                  </v:shape>
+                    </ns10:textbox>
+                    <ns12:wrap anchorx="margin" anchory="page"/>
+                  </ns10:shape>
                 </w:pict>
-              </mc:Fallback>
-            </mc:AlternateContent>
+              </ns1:Fallback>
+            </ns1:AlternateContent>
           </w:r>
           <w:r>
             <w:rPr>
@@ -363,52 +363,52 @@
               <w:color w:val="4472C4" w:themeColor="accent1"/>
             </w:rPr>
             <w:drawing>
-              <wp:inline distT="0" distB="0" distL="0" distR="0" wp14:anchorId="013CDA26" wp14:editId="6341419F">
-                <wp:extent cx="758952" cy="478932"/>
-                <wp:effectExtent l="0" t="0" r="3175" b="0"/>
-                <wp:docPr id="144" name="Imagen 147"/>
-                <wp:cNvGraphicFramePr>
-                  <a:graphicFrameLocks xmlns:a="http://schemas.openxmlformats.org/drawingml/2006/main" noChangeAspect="1"/>
-                </wp:cNvGraphicFramePr>
-                <a:graphic xmlns:a="http://schemas.openxmlformats.org/drawingml/2006/main">
-                  <a:graphicData uri="http://schemas.openxmlformats.org/drawingml/2006/picture">
-                    <pic:pic xmlns:pic="http://schemas.openxmlformats.org/drawingml/2006/picture">
-                      <pic:nvPicPr>
-                        <pic:cNvPr id="9" name="roco bottom.png"/>
-                        <pic:cNvPicPr/>
-                      </pic:nvPicPr>
-                      <pic:blipFill>
-                        <a:blip r:embed="rId9" cstate="print">
-                          <a:duotone>
-                            <a:schemeClr val="accent1">
-                              <a:shade val="45000"/>
-                              <a:satMod val="135000"/>
-                            </a:schemeClr>
-                            <a:prstClr val="white"/>
-                          </a:duotone>
-                          <a:extLst>
-                            <a:ext uri="{28A0092B-C50C-407E-A947-70E740481C1C}">
-                              <a14:useLocalDpi xmlns:a14="http://schemas.microsoft.com/office/drawing/2010/main" val="0"/>
-                            </a:ext>
-                          </a:extLst>
-                        </a:blip>
-                        <a:stretch>
-                          <a:fillRect/>
-                        </a:stretch>
-                      </pic:blipFill>
-                      <pic:spPr>
-                        <a:xfrm>
-                          <a:off x="0" y="0"/>
-                          <a:ext cx="758952" cy="478932"/>
-                        </a:xfrm>
-                        <a:prstGeom prst="rect">
-                          <a:avLst/>
-                        </a:prstGeom>
-                      </pic:spPr>
-                    </pic:pic>
-                  </a:graphicData>
-                </a:graphic>
-              </wp:inline>
+              <ns3:inline distT="0" distB="0" distL="0" distR="0" ns4:anchorId="013CDA26" ns4:editId="6341419F">
+                <ns3:extent cx="758952" cy="478932"/>
+                <ns3:effectExtent l="0" t="0" r="3175" b="0"/>
+                <ns3:docPr id="144" name="Imagen 147"/>
+                <ns3:cNvGraphicFramePr>
+                  <ns5:graphicFrameLocks noChangeAspect="1"/>
+                </ns3:cNvGraphicFramePr>
+                <ns5:graphic>
+                  <ns5:graphicData uri="http://schemas.openxmlformats.org/drawingml/2006/picture">
+                    <ns6:pic>
+                      <ns6:nvPicPr>
+                        <ns6:cNvPr id="9" name="roco bottom.png"/>
+                        <ns6:cNvPicPr/>
+                      </ns6:nvPicPr>
+                      <ns6:blipFill>
+                        <ns5:blip ns7:embed="rId9" cstate="print">
+                          <ns5:duotone>
+                            <ns5:schemeClr val="accent1">
+                              <ns5:shade val="45000"/>
+                              <ns5:satMod val="135000"/>
+                            </ns5:schemeClr>
+                            <ns5:prstClr val="white"/>
+                          </ns5:duotone>
+                          <ns5:extLst>
+                            <ns5:ext uri="{28A0092B-C50C-407E-A947-70E740481C1C}">
+                              <ns8:useLocalDpi val="0"/>
+                            </ns5:ext>
+                          </ns5:extLst>
+                        </ns5:blip>
+                        <ns5:stretch>
+                          <ns5:fillRect/>
+                        </ns5:stretch>
+                      </ns6:blipFill>
+                      <ns6:spPr>
+                        <ns5:xfrm>
+                          <ns5:off x="0" y="0"/>
+                          <ns5:ext cx="758952" cy="478932"/>
+                        </ns5:xfrm>
+                        <ns5:prstGeom prst="rect">
+                          <ns5:avLst/>
+                        </ns5:prstGeom>
+                      </ns6:spPr>
+                    </ns6:pic>
+                  </ns5:graphicData>
+                </ns5:graphic>
+              </ns3:inline>
             </w:drawing>
           </w:r>
         </w:p>
@@ -429,55 +429,55 @@
               <w:noProof/>
               <w:color w:val="4472C4" w:themeColor="accent1"/>
             </w:rPr>
-            <mc:AlternateContent>
-              <mc:Choice Requires="wps">
+            <ns1:AlternateContent>
+              <ns1:Choice Requires="wps">
                 <w:drawing>
-                  <wp:anchor distT="0" distB="0" distL="114300" distR="114300" simplePos="0" relativeHeight="251661312" behindDoc="0" locked="0" layoutInCell="1" allowOverlap="1" wp14:anchorId="7FE8E364" wp14:editId="7CFDEA8D">
-                    <wp:simplePos x="0" y="0"/>
-                    <wp:positionH relativeFrom="margin">
-                      <wp:posOffset>0</wp:posOffset>
-                    </wp:positionH>
-                    <wp:positionV relativeFrom="page">
-                      <wp:posOffset>5992779</wp:posOffset>
-                    </wp:positionV>
-                    <wp:extent cx="6553200" cy="557784"/>
-                    <wp:effectExtent l="0" t="0" r="12700" b="9525"/>
-                    <wp:wrapNone/>
-                    <wp:docPr id="343173295" name="Cuadro de texto 146"/>
-                    <wp:cNvGraphicFramePr/>
-                    <a:graphic xmlns:a="http://schemas.openxmlformats.org/drawingml/2006/main">
-                      <a:graphicData uri="http://schemas.microsoft.com/office/word/2010/wordprocessingShape">
-                        <wps:wsp>
-                          <wps:cNvSpPr txBox="1"/>
-                          <wps:spPr>
-                            <a:xfrm>
-                              <a:off x="0" y="0"/>
-                              <a:ext cx="6553200" cy="557784"/>
-                            </a:xfrm>
-                            <a:prstGeom prst="rect">
-                              <a:avLst/>
-                            </a:prstGeom>
-                            <a:noFill/>
-                            <a:ln w="6350">
-                              <a:noFill/>
-                            </a:ln>
-                            <a:effectLst/>
-                          </wps:spPr>
-                          <wps:style>
-                            <a:lnRef idx="0">
-                              <a:schemeClr val="accent1"/>
-                            </a:lnRef>
-                            <a:fillRef idx="0">
-                              <a:schemeClr val="accent1"/>
-                            </a:fillRef>
-                            <a:effectRef idx="0">
-                              <a:schemeClr val="accent1"/>
-                            </a:effectRef>
-                            <a:fontRef idx="minor">
-                              <a:schemeClr val="dk1"/>
-                            </a:fontRef>
-                          </wps:style>
-                          <wps:txbx>
+                  <ns3:anchor distT="0" distB="0" distL="114300" distR="114300" simplePos="0" relativeHeight="251661312" behindDoc="0" locked="0" layoutInCell="1" allowOverlap="1" ns4:anchorId="7FE8E364" ns4:editId="7CFDEA8D">
+                    <ns3:simplePos x="0" y="0"/>
+                    <ns3:positionH relativeFrom="margin">
+                      <ns3:posOffset>0</ns3:posOffset>
+                    </ns3:positionH>
+                    <ns3:positionV relativeFrom="page">
+                      <ns3:posOffset>5992779</ns3:posOffset>
+                    </ns3:positionV>
+                    <ns3:extent cx="6553200" cy="557784"/>
+                    <ns3:effectExtent l="0" t="0" r="12700" b="9525"/>
+                    <ns3:wrapNone/>
+                    <ns3:docPr id="343173295" name="Cuadro de texto 146"/>
+                    <ns3:cNvGraphicFramePr/>
+                    <ns5:graphic>
+                      <ns5:graphicData uri="http://schemas.microsoft.com/office/word/2010/wordprocessingShape">
+                        <ns9:wsp>
+                          <ns9:cNvSpPr txBox="1"/>
+                          <ns9:spPr>
+                            <ns5:xfrm>
+                              <ns5:off x="0" y="0"/>
+                              <ns5:ext cx="6553200" cy="557784"/>
+                            </ns5:xfrm>
+                            <ns5:prstGeom prst="rect">
+                              <ns5:avLst/>
+                            </ns5:prstGeom>
+                            <ns5:noFill/>
+                            <ns5:ln w="6350">
+                              <ns5:noFill/>
+                            </ns5:ln>
+                            <ns5:effectLst/>
+                          </ns9:spPr>
+                          <ns9:style>
+                            <ns5:lnRef idx="0">
+                              <ns5:schemeClr val="accent1"/>
+                            </ns5:lnRef>
+                            <ns5:fillRef idx="0">
+                              <ns5:schemeClr val="accent1"/>
+                            </ns5:fillRef>
+                            <ns5:effectRef idx="0">
+                              <ns5:schemeClr val="accent1"/>
+                            </ns5:effectRef>
+                            <ns5:fontRef idx="minor">
+                              <ns5:schemeClr val="dk1"/>
+                            </ns5:fontRef>
+                          </ns9:style>
+                          <ns9:txbx>
                             <w:txbxContent>
                               <w:p>
                                 <w:pPr>
@@ -545,29 +545,29 @@
                                 </w:r>
                               </w:p>
                             </w:txbxContent>
-                          </wps:txbx>
-                          <wps:bodyPr rot="0" spcFirstLastPara="0" vertOverflow="overflow" horzOverflow="overflow" vert="horz" wrap="square" lIns="0" tIns="0" rIns="0" bIns="0" numCol="1" spcCol="0" rtlCol="0" fromWordArt="0" anchor="b" anchorCtr="0" forceAA="0" compatLnSpc="1">
-                            <a:prstTxWarp prst="textNoShape">
-                              <a:avLst/>
-                            </a:prstTxWarp>
-                            <a:spAutoFit/>
-                          </wps:bodyPr>
-                        </wps:wsp>
-                      </a:graphicData>
-                    </a:graphic>
-                    <wp14:sizeRelH relativeFrom="margin">
-                      <wp14:pctWidth>100000</wp14:pctWidth>
-                    </wp14:sizeRelH>
-                    <wp14:sizeRelV relativeFrom="margin">
-                      <wp14:pctHeight>0</wp14:pctHeight>
-                    </wp14:sizeRelV>
-                  </wp:anchor>
+                          </ns9:txbx>
+                          <ns9:bodyPr rot="0" spcFirstLastPara="0" vertOverflow="overflow" horzOverflow="overflow" vert="horz" wrap="square" lIns="0" tIns="0" rIns="0" bIns="0" numCol="1" spcCol="0" rtlCol="0" fromWordArt="0" anchor="b" anchorCtr="0" forceAA="0" compatLnSpc="1">
+                            <ns5:prstTxWarp prst="textNoShape">
+                              <ns5:avLst/>
+                            </ns5:prstTxWarp>
+                            <ns5:spAutoFit/>
+                          </ns9:bodyPr>
+                        </ns9:wsp>
+                      </ns5:graphicData>
+                    </ns5:graphic>
+                    <ns4:sizeRelH relativeFrom="margin">
+                      <ns4:pctWidth>100000</ns4:pctWidth>
+                    </ns4:sizeRelH>
+                    <ns4:sizeRelV relativeFrom="margin">
+                      <ns4:pctHeight>0</ns4:pctHeight>
+                    </ns4:sizeRelV>
+                  </ns3:anchor>
                 </w:drawing>
-              </mc:Choice>
-              <mc:Fallback>
+              </ns1:Choice>
+              <ns1:Fallback>
                 <w:pict>
-                  <v:shape w14:anchorId="7FE8E364" id="_x0000_s1027" type="#_x0000_t202" style="position:absolute;margin-left:0;margin-top:471.85pt;width:516pt;height:43.9pt;z-index:251661312;visibility:visible;mso-wrap-style:square;mso-width-percent:1000;mso-height-percent:0;mso-wrap-distance-left:9pt;mso-wrap-distance-top:0;mso-wrap-distance-right:9pt;mso-wrap-distance-bottom:0;mso-position-horizontal:absolute;mso-position-horizontal-relative:margin;mso-position-vertical:absolute;mso-position-vertical-relative:page;mso-width-percent:1000;mso-height-percent:0;mso-width-relative:margin;mso-height-relative:margin;v-text-anchor:bottom" o:gfxdata="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" filled="f" stroked="f" strokeweight=".5pt">
-                    <v:textbox style="mso-fit-shape-to-text:t" inset="0,0,0,0">
+                  <ns10:shape w14:anchorId="7FE8E364" id="_x0000_s1027" type="#_x0000_t202" style="position:absolute;margin-left:0;margin-top:471.85pt;width:516pt;height:43.9pt;z-index:251661312;visibility:visible;mso-wrap-style:square;mso-width-percent:1000;mso-height-percent:0;mso-wrap-distance-left:9pt;mso-wrap-distance-top:0;mso-wrap-distance-right:9pt;mso-wrap-distance-bottom:0;mso-position-horizontal:absolute;mso-position-horizontal-relative:margin;mso-position-vertical:absolute;mso-position-vertical-relative:page;mso-width-percent:1000;mso-height-percent:0;mso-width-relative:margin;mso-height-relative:margin;v-text-anchor:bottom" ns11:gfxdata="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" filled="f" stroked="f" strokeweight=".5pt">
+                    <ns10:textbox style="mso-fit-shape-to-text:t" inset="0,0,0,0">
                       <w:txbxContent>
                         <w:p>
                           <w:pPr>
@@ -635,12 +635,12 @@
                           </w:r>
                         </w:p>
                       </w:txbxContent>
-                    </v:textbox>
-                    <w10:wrap anchorx="margin" anchory="page"/>
-                  </v:shape>
+                    </ns10:textbox>
+                    <ns12:wrap anchorx="margin" anchory="page"/>
+                  </ns10:shape>
                 </w:pict>
-              </mc:Fallback>
-            </mc:AlternateContent>
+              </ns1:Fallback>
+            </ns1:AlternateContent>
           </w:r>
         </w:p>
       </w:sdtContent>
@@ -676,7 +676,7 @@
           <w:lang w:eastAsia="es-ES"/>
         </w:rPr>
         <w:sectPr>
-          <w:headerReference w:type="default" r:id="rId10"/>
+          <w:headerReference w:type="default" ns7:id="rId10"/>
           <w:pgSz w:w="11906" w:h="16838"/>
           <w:pgMar w:top="1418" w:right="1418" w:bottom="1418" w:left="1418" w:header="709" w:footer="709" w:gutter="0"/>
           <w:pgNumType w:start="0"/>
@@ -2839,28 +2839,24 @@
         <w:gridCol w:w="2945"/>
       </w:tblGrid>
       <w:tr>
+        <w:trPr/>
         <w:tc>
           <w:tcPr>
             <w:tcW w:w="0" w:type="auto"/>
-            <w:hideMark/>
           </w:tcPr>
           <w:p>
             <w:pPr>
               <w:spacing w:after="0" w:line="240" w:lineRule="auto"/>
-              <w:jc w:val="center"/>
               <w:rPr>
                 <w:rFonts w:eastAsia="Times New Roman" w:cstheme="minorHAnsi"/>
+                <w:lang w:val="es-EC" w:eastAsia="ja-JP"/>
+              </w:rPr>
+            </w:pPr>
+            <w:r>
+              <w:rPr>
+                <w:rFonts w:eastAsia="Times New Roman" w:cstheme="minorHAnsi"/>
+                <w:lang w:val="es-EC" w:eastAsia="ja-JP"/>
                 <w:b/>
-                <w:bCs/>
-                <w:lang w:val="es-EC" w:eastAsia="ja-JP"/>
-              </w:rPr>
-            </w:pPr>
-            <w:r>
-              <w:rPr>
-                <w:rFonts w:eastAsia="Times New Roman" w:cstheme="minorHAnsi"/>
-                <w:b/>
-                <w:bCs/>
-                <w:lang w:val="es-EC" w:eastAsia="ja-JP"/>
               </w:rPr>
               <w:t>Variable</w:t>
             </w:r>
@@ -2869,52 +2865,42 @@
         <w:tc>
           <w:tcPr>
             <w:tcW w:w="0" w:type="auto"/>
-            <w:hideMark/>
           </w:tcPr>
           <w:p>
             <w:pPr>
               <w:spacing w:after="0" w:line="240" w:lineRule="auto"/>
-              <w:jc w:val="center"/>
               <w:rPr>
                 <w:rFonts w:eastAsia="Times New Roman" w:cstheme="minorHAnsi"/>
+                <w:lang w:val="es-EC" w:eastAsia="ja-JP"/>
+              </w:rPr>
+            </w:pPr>
+            <w:r>
+              <w:rPr>
+                <w:rFonts w:eastAsia="Times New Roman" w:cstheme="minorHAnsi"/>
+                <w:lang w:val="es-EC" w:eastAsia="ja-JP"/>
                 <w:b/>
-                <w:bCs/>
-                <w:lang w:val="es-EC" w:eastAsia="ja-JP"/>
-              </w:rPr>
-            </w:pPr>
-            <w:r>
-              <w:rPr>
-                <w:rFonts w:eastAsia="Times New Roman" w:cstheme="minorHAnsi"/>
-                <w:b/>
-                <w:bCs/>
-                <w:lang w:val="es-EC" w:eastAsia="ja-JP"/>
-              </w:rPr>
-              <w:t>Descripción</w:t>
+              </w:rPr>
+              <w:t>Descripcion</w:t>
             </w:r>
           </w:p>
         </w:tc>
         <w:tc>
           <w:tcPr>
             <w:tcW w:w="0" w:type="auto"/>
-            <w:hideMark/>
           </w:tcPr>
           <w:p>
             <w:pPr>
               <w:spacing w:after="0" w:line="240" w:lineRule="auto"/>
-              <w:jc w:val="center"/>
               <w:rPr>
                 <w:rFonts w:eastAsia="Times New Roman" w:cstheme="minorHAnsi"/>
+                <w:lang w:val="es-EC" w:eastAsia="ja-JP"/>
+              </w:rPr>
+            </w:pPr>
+            <w:r>
+              <w:rPr>
+                <w:rFonts w:eastAsia="Times New Roman" w:cstheme="minorHAnsi"/>
+                <w:lang w:val="es-EC" w:eastAsia="ja-JP"/>
                 <w:b/>
-                <w:bCs/>
-                <w:lang w:val="es-EC" w:eastAsia="ja-JP"/>
-              </w:rPr>
-            </w:pPr>
-            <w:r>
-              <w:rPr>
-                <w:rFonts w:eastAsia="Times New Roman" w:cstheme="minorHAnsi"/>
-                <w:b/>
-                <w:bCs/>
-                <w:lang w:val="es-EC" w:eastAsia="ja-JP"/>
               </w:rPr>
               <w:t>Utilidad en el proyecto</w:t>
             </w:r>
@@ -2922,10 +2908,10 @@
         </w:tc>
       </w:tr>
       <w:tr>
+        <w:trPr/>
         <w:tc>
           <w:tcPr>
             <w:tcW w:w="0" w:type="auto"/>
-            <w:hideMark/>
           </w:tcPr>
           <w:p>
             <w:pPr>
@@ -2935,7 +2921,6 @@
                 <w:lang w:val="es-EC" w:eastAsia="ja-JP"/>
               </w:rPr>
             </w:pPr>
-            <w:proofErr w:type="spellStart"/>
             <w:r>
               <w:rPr>
                 <w:rFonts w:eastAsia="Times New Roman" w:cstheme="minorHAnsi"/>
@@ -2943,13 +2928,11 @@
               </w:rPr>
               <w:t>estimated_owners</w:t>
             </w:r>
-            <w:proofErr w:type="spellEnd"/>
           </w:p>
         </w:tc>
         <w:tc>
           <w:tcPr>
             <w:tcW w:w="0" w:type="auto"/>
-            <w:hideMark/>
           </w:tcPr>
           <w:p>
             <w:pPr>
@@ -2964,21 +2947,13 @@
                 <w:rFonts w:eastAsia="Times New Roman" w:cstheme="minorHAnsi"/>
                 <w:lang w:val="es-EC" w:eastAsia="ja-JP"/>
               </w:rPr>
-              <w:t xml:space="preserve">Número </w:t>
-            </w:r>
-            <w:r>
-              <w:rPr>
-                <w:rFonts w:eastAsia="Times New Roman" w:cstheme="minorHAnsi"/>
-                <w:lang w:val="es-EC" w:eastAsia="ja-JP"/>
-              </w:rPr>
-              <w:t>estimado de usuarios que poseen el juego (ventas)</w:t>
+              <w:t>Ventas estimadas continuas obtenidas del punto medio del rango de compradores</w:t>
             </w:r>
           </w:p>
         </w:tc>
         <w:tc>
           <w:tcPr>
             <w:tcW w:w="0" w:type="auto"/>
-            <w:hideMark/>
           </w:tcPr>
           <w:p>
             <w:pPr>
@@ -2993,23 +2968,16 @@
                 <w:rFonts w:eastAsia="Times New Roman" w:cstheme="minorHAnsi"/>
                 <w:lang w:val="es-EC" w:eastAsia="ja-JP"/>
               </w:rPr>
-              <w:t>Es la v</w:t>
-            </w:r>
-            <w:r>
-              <w:rPr>
-                <w:rFonts w:eastAsia="Times New Roman" w:cstheme="minorHAnsi"/>
-                <w:lang w:val="es-EC" w:eastAsia="ja-JP"/>
-              </w:rPr>
-              <w:t>ariable principal para medir popularidad</w:t>
+              <w:t>Variable objetivo eje Y a estimar en el modelo</w:t>
             </w:r>
           </w:p>
         </w:tc>
       </w:tr>
       <w:tr>
+        <w:trPr/>
         <w:tc>
           <w:tcPr>
             <w:tcW w:w="0" w:type="auto"/>
-            <w:hideMark/>
           </w:tcPr>
           <w:p>
             <w:pPr>
@@ -3024,14 +2992,13 @@
                 <w:rFonts w:eastAsia="Times New Roman" w:cstheme="minorHAnsi"/>
                 <w:lang w:val="es-EC" w:eastAsia="ja-JP"/>
               </w:rPr>
-              <w:t>positive</w:t>
+              <w:t>price_usd</w:t>
             </w:r>
           </w:p>
         </w:tc>
         <w:tc>
           <w:tcPr>
             <w:tcW w:w="0" w:type="auto"/>
-            <w:hideMark/>
           </w:tcPr>
           <w:p>
             <w:pPr>
@@ -3046,14 +3013,13 @@
                 <w:rFonts w:eastAsia="Times New Roman" w:cstheme="minorHAnsi"/>
                 <w:lang w:val="es-EC" w:eastAsia="ja-JP"/>
               </w:rPr>
-              <w:t>Cantidad de reseñas positivas</w:t>
+              <w:t>Precio de venta normalizado en dolares</w:t>
             </w:r>
           </w:p>
         </w:tc>
         <w:tc>
           <w:tcPr>
             <w:tcW w:w="0" w:type="auto"/>
-            <w:hideMark/>
           </w:tcPr>
           <w:p>
             <w:pPr>
@@ -3068,30 +3034,16 @@
                 <w:rFonts w:eastAsia="Times New Roman" w:cstheme="minorHAnsi"/>
                 <w:lang w:val="es-EC" w:eastAsia="ja-JP"/>
               </w:rPr>
-              <w:t>M</w:t>
-            </w:r>
-            <w:r>
-              <w:rPr>
-                <w:rFonts w:eastAsia="Times New Roman" w:cstheme="minorHAnsi"/>
-                <w:lang w:val="es-EC" w:eastAsia="ja-JP"/>
-              </w:rPr>
-              <w:t>ide la</w:t>
-            </w:r>
-            <w:r>
-              <w:rPr>
-                <w:rFonts w:eastAsia="Times New Roman" w:cstheme="minorHAnsi"/>
-                <w:lang w:val="es-EC" w:eastAsia="ja-JP"/>
-              </w:rPr>
-              <w:t xml:space="preserve"> aceptación de usuarios</w:t>
+              <w:t>Variable independiente eje X para modelar la curva de demanda</w:t>
             </w:r>
           </w:p>
         </w:tc>
       </w:tr>
       <w:tr>
+        <w:trPr/>
         <w:tc>
           <w:tcPr>
             <w:tcW w:w="0" w:type="auto"/>
-            <w:hideMark/>
           </w:tcPr>
           <w:p>
             <w:pPr>
@@ -3101,21 +3053,18 @@
                 <w:lang w:val="es-EC" w:eastAsia="ja-JP"/>
               </w:rPr>
             </w:pPr>
-            <w:proofErr w:type="spellStart"/>
             <w:r>
               <w:rPr>
                 <w:rFonts w:eastAsia="Times New Roman" w:cstheme="minorHAnsi"/>
                 <w:lang w:val="es-EC" w:eastAsia="ja-JP"/>
               </w:rPr>
-              <w:t>average_playtime_forever</w:t>
-            </w:r>
-            <w:proofErr w:type="spellEnd"/>
+              <w:t>steamspy_initial_price</w:t>
+            </w:r>
           </w:p>
         </w:tc>
         <w:tc>
           <w:tcPr>
             <w:tcW w:w="0" w:type="auto"/>
-            <w:hideMark/>
           </w:tcPr>
           <w:p>
             <w:pPr>
@@ -3130,14 +3079,13 @@
                 <w:rFonts w:eastAsia="Times New Roman" w:cstheme="minorHAnsi"/>
                 <w:lang w:val="es-EC" w:eastAsia="ja-JP"/>
               </w:rPr>
-              <w:t>Tiempo promedio total de juego</w:t>
+              <w:t>Precio de venta original del videojuego en dolares</w:t>
             </w:r>
           </w:p>
         </w:tc>
         <w:tc>
           <w:tcPr>
             <w:tcW w:w="0" w:type="auto"/>
-            <w:hideMark/>
           </w:tcPr>
           <w:p>
             <w:pPr>
@@ -3152,44 +3100,16 @@
                 <w:rFonts w:eastAsia="Times New Roman" w:cstheme="minorHAnsi"/>
                 <w:lang w:val="es-EC" w:eastAsia="ja-JP"/>
               </w:rPr>
-              <w:t>M</w:t>
-            </w:r>
-            <w:r>
-              <w:rPr>
-                <w:rFonts w:eastAsia="Times New Roman" w:cstheme="minorHAnsi"/>
-                <w:lang w:val="es-EC" w:eastAsia="ja-JP"/>
-              </w:rPr>
-              <w:t>ide el</w:t>
-            </w:r>
-            <w:r>
-              <w:rPr>
-                <w:rFonts w:eastAsia="Times New Roman" w:cstheme="minorHAnsi"/>
-                <w:lang w:val="es-EC" w:eastAsia="ja-JP"/>
-              </w:rPr>
-              <w:t xml:space="preserve"> nivel de interacción de </w:t>
-            </w:r>
-            <w:r>
-              <w:rPr>
-                <w:rFonts w:eastAsia="Times New Roman" w:cstheme="minorHAnsi"/>
-                <w:lang w:val="es-EC" w:eastAsia="ja-JP"/>
-              </w:rPr>
-              <w:t xml:space="preserve">los </w:t>
-            </w:r>
-            <w:r>
-              <w:rPr>
-                <w:rFonts w:eastAsia="Times New Roman" w:cstheme="minorHAnsi"/>
-                <w:lang w:val="es-EC" w:eastAsia="ja-JP"/>
-              </w:rPr>
-              <w:t>usuarios</w:t>
+              <w:t>Variable independiente eje X para evaluar el impacto de los descuentos</w:t>
             </w:r>
           </w:p>
         </w:tc>
       </w:tr>
       <w:tr>
+        <w:trPr/>
         <w:tc>
           <w:tcPr>
             <w:tcW w:w="0" w:type="auto"/>
-            <w:hideMark/>
           </w:tcPr>
           <w:p>
             <w:pPr>
@@ -3199,21 +3119,18 @@
                 <w:lang w:val="es-EC" w:eastAsia="ja-JP"/>
               </w:rPr>
             </w:pPr>
-            <w:proofErr w:type="spellStart"/>
             <w:r>
               <w:rPr>
                 <w:rFonts w:eastAsia="Times New Roman" w:cstheme="minorHAnsi"/>
                 <w:lang w:val="es-EC" w:eastAsia="ja-JP"/>
               </w:rPr>
-              <w:t>peak_ccu</w:t>
-            </w:r>
-            <w:proofErr w:type="spellEnd"/>
+              <w:t>steamspy_discount</w:t>
+            </w:r>
           </w:p>
         </w:tc>
         <w:tc>
           <w:tcPr>
             <w:tcW w:w="0" w:type="auto"/>
-            <w:hideMark/>
           </w:tcPr>
           <w:p>
             <w:pPr>
@@ -3228,14 +3145,13 @@
                 <w:rFonts w:eastAsia="Times New Roman" w:cstheme="minorHAnsi"/>
                 <w:lang w:val="es-EC" w:eastAsia="ja-JP"/>
               </w:rPr>
-              <w:t>Máximo histórico de usuarios concurrentes</w:t>
+              <w:t>Porcentaje de descuento o rebaja activa del videojuego</w:t>
             </w:r>
           </w:p>
         </w:tc>
         <w:tc>
           <w:tcPr>
             <w:tcW w:w="0" w:type="auto"/>
-            <w:hideMark/>
           </w:tcPr>
           <w:p>
             <w:pPr>
@@ -3250,30 +3166,16 @@
                 <w:rFonts w:eastAsia="Times New Roman" w:cstheme="minorHAnsi"/>
                 <w:lang w:val="es-EC" w:eastAsia="ja-JP"/>
               </w:rPr>
-              <w:t>Indica la</w:t>
-            </w:r>
-            <w:r>
-              <w:rPr>
-                <w:rFonts w:eastAsia="Times New Roman" w:cstheme="minorHAnsi"/>
-                <w:lang w:val="es-EC" w:eastAsia="ja-JP"/>
-              </w:rPr>
-              <w:t xml:space="preserve"> popularidad </w:t>
-            </w:r>
-            <w:r>
-              <w:rPr>
-                <w:rFonts w:eastAsia="Times New Roman" w:cstheme="minorHAnsi"/>
-                <w:lang w:val="es-EC" w:eastAsia="ja-JP"/>
-              </w:rPr>
-              <w:t>máxima del juego</w:t>
+              <w:t>Variable independiente eje X para evaluar ofertas</w:t>
             </w:r>
           </w:p>
         </w:tc>
       </w:tr>
       <w:tr>
+        <w:trPr/>
         <w:tc>
           <w:tcPr>
             <w:tcW w:w="0" w:type="auto"/>
-            <w:hideMark/>
           </w:tcPr>
           <w:p>
             <w:pPr>
@@ -3283,21 +3185,18 @@
                 <w:lang w:val="es-EC" w:eastAsia="ja-JP"/>
               </w:rPr>
             </w:pPr>
-            <w:proofErr w:type="spellStart"/>
             <w:r>
               <w:rPr>
                 <w:rFonts w:eastAsia="Times New Roman" w:cstheme="minorHAnsi"/>
                 <w:lang w:val="es-EC" w:eastAsia="ja-JP"/>
               </w:rPr>
-              <w:t>price</w:t>
-            </w:r>
-            <w:proofErr w:type="spellEnd"/>
+              <w:t>approval_ratio</w:t>
+            </w:r>
           </w:p>
         </w:tc>
         <w:tc>
           <w:tcPr>
             <w:tcW w:w="0" w:type="auto"/>
-            <w:hideMark/>
           </w:tcPr>
           <w:p>
             <w:pPr>
@@ -3312,14 +3211,13 @@
                 <w:rFonts w:eastAsia="Times New Roman" w:cstheme="minorHAnsi"/>
                 <w:lang w:val="es-EC" w:eastAsia="ja-JP"/>
               </w:rPr>
-              <w:t>Precio del videojuego</w:t>
+              <w:t>Proporcionalidad de aprobacion continua de los usuarios de cero a uno</w:t>
             </w:r>
           </w:p>
         </w:tc>
         <w:tc>
           <w:tcPr>
             <w:tcW w:w="0" w:type="auto"/>
-            <w:hideMark/>
           </w:tcPr>
           <w:p>
             <w:pPr>
@@ -3334,30 +3232,16 @@
                 <w:rFonts w:eastAsia="Times New Roman" w:cstheme="minorHAnsi"/>
                 <w:lang w:val="es-EC" w:eastAsia="ja-JP"/>
               </w:rPr>
-              <w:t>Evalúa</w:t>
-            </w:r>
-            <w:r>
-              <w:rPr>
-                <w:rFonts w:eastAsia="Times New Roman" w:cstheme="minorHAnsi"/>
-                <w:lang w:val="es-EC" w:eastAsia="ja-JP"/>
-              </w:rPr>
-              <w:t xml:space="preserve"> el</w:t>
-            </w:r>
-            <w:r>
-              <w:rPr>
-                <w:rFonts w:eastAsia="Times New Roman" w:cstheme="minorHAnsi"/>
-                <w:lang w:val="es-EC" w:eastAsia="ja-JP"/>
-              </w:rPr>
-              <w:t xml:space="preserve"> impacto económico</w:t>
+              <w:t>Variable independiente eje X para evaluar la satisfaccion de la comunidad</w:t>
             </w:r>
           </w:p>
         </w:tc>
       </w:tr>
       <w:tr>
+        <w:trPr/>
         <w:tc>
           <w:tcPr>
             <w:tcW w:w="0" w:type="auto"/>
-            <w:hideMark/>
           </w:tcPr>
           <w:p>
             <w:pPr>
@@ -3367,21 +3251,18 @@
                 <w:lang w:val="es-EC" w:eastAsia="ja-JP"/>
               </w:rPr>
             </w:pPr>
-            <w:proofErr w:type="spellStart"/>
             <w:r>
               <w:rPr>
                 <w:rFonts w:eastAsia="Times New Roman" w:cstheme="minorHAnsi"/>
                 <w:lang w:val="es-EC" w:eastAsia="ja-JP"/>
               </w:rPr>
-              <w:t>metacritic_score</w:t>
-            </w:r>
-            <w:proofErr w:type="spellEnd"/>
+              <w:t>reviews_total</w:t>
+            </w:r>
           </w:p>
         </w:tc>
         <w:tc>
           <w:tcPr>
             <w:tcW w:w="0" w:type="auto"/>
-            <w:hideMark/>
           </w:tcPr>
           <w:p>
             <w:pPr>
@@ -3396,14 +3277,13 @@
                 <w:rFonts w:eastAsia="Times New Roman" w:cstheme="minorHAnsi"/>
                 <w:lang w:val="es-EC" w:eastAsia="ja-JP"/>
               </w:rPr>
-              <w:t>Puntuación obtenida en Metacritic</w:t>
+              <w:t>Volumen total de valoraciones de los usuarios registradas en Steam</w:t>
             </w:r>
           </w:p>
         </w:tc>
         <w:tc>
           <w:tcPr>
             <w:tcW w:w="0" w:type="auto"/>
-            <w:hideMark/>
           </w:tcPr>
           <w:p>
             <w:pPr>
@@ -3418,23 +3298,16 @@
                 <w:rFonts w:eastAsia="Times New Roman" w:cstheme="minorHAnsi"/>
                 <w:lang w:val="es-EC" w:eastAsia="ja-JP"/>
               </w:rPr>
-              <w:t>Indica la r</w:t>
-            </w:r>
-            <w:r>
-              <w:rPr>
-                <w:rFonts w:eastAsia="Times New Roman" w:cstheme="minorHAnsi"/>
-                <w:lang w:val="es-EC" w:eastAsia="ja-JP"/>
-              </w:rPr>
-              <w:t>elación entre calidad y popularidad</w:t>
+              <w:t>Variable independiente eje X para medir la magnitud y alcance</w:t>
             </w:r>
           </w:p>
         </w:tc>
       </w:tr>
       <w:tr>
+        <w:trPr/>
         <w:tc>
           <w:tcPr>
             <w:tcW w:w="0" w:type="auto"/>
-            <w:hideMark/>
           </w:tcPr>
           <w:p>
             <w:pPr>
@@ -3444,21 +3317,18 @@
                 <w:lang w:val="es-EC" w:eastAsia="ja-JP"/>
               </w:rPr>
             </w:pPr>
-            <w:proofErr w:type="spellStart"/>
             <w:r>
               <w:rPr>
                 <w:rFonts w:eastAsia="Times New Roman" w:cstheme="minorHAnsi"/>
                 <w:lang w:val="es-EC" w:eastAsia="ja-JP"/>
               </w:rPr>
-              <w:t>genres</w:t>
-            </w:r>
-            <w:proofErr w:type="spellEnd"/>
+              <w:t>concurrent_users_yesterday</w:t>
+            </w:r>
           </w:p>
         </w:tc>
         <w:tc>
           <w:tcPr>
             <w:tcW w:w="0" w:type="auto"/>
-            <w:hideMark/>
           </w:tcPr>
           <w:p>
             <w:pPr>
@@ -3473,21 +3343,13 @@
                 <w:rFonts w:eastAsia="Times New Roman" w:cstheme="minorHAnsi"/>
                 <w:lang w:val="es-EC" w:eastAsia="ja-JP"/>
               </w:rPr>
-              <w:t>Son los g</w:t>
-            </w:r>
-            <w:r>
-              <w:rPr>
-                <w:rFonts w:eastAsia="Times New Roman" w:cstheme="minorHAnsi"/>
-                <w:lang w:val="es-EC" w:eastAsia="ja-JP"/>
-              </w:rPr>
-              <w:t>éneros asociados al videojuego</w:t>
+              <w:t>Usuarios concurrentes activos en las ultimas veinticuatro horas</w:t>
             </w:r>
           </w:p>
         </w:tc>
         <w:tc>
           <w:tcPr>
             <w:tcW w:w="0" w:type="auto"/>
-            <w:hideMark/>
           </w:tcPr>
           <w:p>
             <w:pPr>
@@ -3502,23 +3364,16 @@
                 <w:rFonts w:eastAsia="Times New Roman" w:cstheme="minorHAnsi"/>
                 <w:lang w:val="es-EC" w:eastAsia="ja-JP"/>
               </w:rPr>
-              <w:t>Indica la c</w:t>
-            </w:r>
-            <w:r>
-              <w:rPr>
-                <w:rFonts w:eastAsia="Times New Roman" w:cstheme="minorHAnsi"/>
-                <w:lang w:val="es-EC" w:eastAsia="ja-JP"/>
-              </w:rPr>
-              <w:t>lasificación y segmentación</w:t>
+              <w:t>Variable independiente eje X para medir la popularidad activa reciente</w:t>
             </w:r>
           </w:p>
         </w:tc>
       </w:tr>
       <w:tr>
+        <w:trPr/>
         <w:tc>
           <w:tcPr>
             <w:tcW w:w="0" w:type="auto"/>
-            <w:hideMark/>
           </w:tcPr>
           <w:p>
             <w:pPr>
@@ -3533,14 +3388,13 @@
                 <w:rFonts w:eastAsia="Times New Roman" w:cstheme="minorHAnsi"/>
                 <w:lang w:val="es-EC" w:eastAsia="ja-JP"/>
               </w:rPr>
-              <w:t>tags</w:t>
+              <w:t>is_free</w:t>
             </w:r>
           </w:p>
         </w:tc>
         <w:tc>
           <w:tcPr>
             <w:tcW w:w="0" w:type="auto"/>
-            <w:hideMark/>
           </w:tcPr>
           <w:p>
             <w:pPr>
@@ -3555,14 +3409,13 @@
                 <w:rFonts w:eastAsia="Times New Roman" w:cstheme="minorHAnsi"/>
                 <w:lang w:val="es-EC" w:eastAsia="ja-JP"/>
               </w:rPr>
-              <w:t>Etiquetas descriptivas del videojuego</w:t>
+              <w:t>Indicador binario discreto de gratuidad de uno si es gratis o cero si es de pago</w:t>
             </w:r>
           </w:p>
         </w:tc>
         <w:tc>
           <w:tcPr>
             <w:tcW w:w="0" w:type="auto"/>
-            <w:hideMark/>
           </w:tcPr>
           <w:p>
             <w:pPr>
@@ -3577,37 +3430,16 @@
                 <w:rFonts w:eastAsia="Times New Roman" w:cstheme="minorHAnsi"/>
                 <w:lang w:val="es-EC" w:eastAsia="ja-JP"/>
               </w:rPr>
-              <w:t xml:space="preserve">Identificación de </w:t>
-            </w:r>
-            <w:r>
-              <w:rPr>
-                <w:rFonts w:eastAsia="Times New Roman" w:cstheme="minorHAnsi"/>
-                <w:lang w:val="es-EC" w:eastAsia="ja-JP"/>
-              </w:rPr>
-              <w:t xml:space="preserve">las </w:t>
-            </w:r>
-            <w:r>
-              <w:rPr>
-                <w:rFonts w:eastAsia="Times New Roman" w:cstheme="minorHAnsi"/>
-                <w:lang w:val="es-EC" w:eastAsia="ja-JP"/>
-              </w:rPr>
-              <w:t>tendencias</w:t>
-            </w:r>
-            <w:r>
-              <w:rPr>
-                <w:rFonts w:eastAsia="Times New Roman" w:cstheme="minorHAnsi"/>
-                <w:lang w:val="es-EC" w:eastAsia="ja-JP"/>
-              </w:rPr>
-              <w:t xml:space="preserve"> y soporte</w:t>
+              <w:t>Variable independiente eje X para segmentacion del modelo</w:t>
             </w:r>
           </w:p>
         </w:tc>
       </w:tr>
       <w:tr>
+        <w:trPr/>
         <w:tc>
           <w:tcPr>
             <w:tcW w:w="0" w:type="auto"/>
-            <w:hideMark/>
           </w:tcPr>
           <w:p>
             <w:pPr>
@@ -3617,21 +3449,18 @@
                 <w:lang w:val="es-EC" w:eastAsia="ja-JP"/>
               </w:rPr>
             </w:pPr>
-            <w:proofErr w:type="spellStart"/>
             <w:r>
               <w:rPr>
                 <w:rFonts w:eastAsia="Times New Roman" w:cstheme="minorHAnsi"/>
                 <w:lang w:val="es-EC" w:eastAsia="ja-JP"/>
               </w:rPr>
-              <w:t>dlc_count</w:t>
-            </w:r>
-            <w:proofErr w:type="spellEnd"/>
+              <w:t>language_count</w:t>
+            </w:r>
           </w:p>
         </w:tc>
         <w:tc>
           <w:tcPr>
             <w:tcW w:w="0" w:type="auto"/>
-            <w:hideMark/>
           </w:tcPr>
           <w:p>
             <w:pPr>
@@ -3646,14 +3475,13 @@
                 <w:rFonts w:eastAsia="Times New Roman" w:cstheme="minorHAnsi"/>
                 <w:lang w:val="es-EC" w:eastAsia="ja-JP"/>
               </w:rPr>
-              <w:t>Cantidad de contenido descargable (DLC)</w:t>
+              <w:t>Cantidad total de idiomas de localizacion soportados por el juego</w:t>
             </w:r>
           </w:p>
         </w:tc>
         <w:tc>
           <w:tcPr>
             <w:tcW w:w="0" w:type="auto"/>
-            <w:hideMark/>
           </w:tcPr>
           <w:p>
             <w:pPr>
@@ -3668,14 +3496,139 @@
                 <w:rFonts w:eastAsia="Times New Roman" w:cstheme="minorHAnsi"/>
                 <w:lang w:val="es-EC" w:eastAsia="ja-JP"/>
               </w:rPr>
-              <w:t>Indica la r</w:t>
-            </w:r>
-            <w:r>
+              <w:t>Variable independiente eje X para evaluar la accesibilidad global</w:t>
+            </w:r>
+          </w:p>
+        </w:tc>
+      </w:tr>
+      <w:tr>
+        <w:trPr/>
+        <w:tc>
+          <w:tcPr>
+            <w:tcW w:w="0" w:type="auto"/>
+          </w:tcPr>
+          <w:p>
+            <w:pPr>
+              <w:spacing w:after="0" w:line="240" w:lineRule="auto"/>
               <w:rPr>
                 <w:rFonts w:eastAsia="Times New Roman" w:cstheme="minorHAnsi"/>
                 <w:lang w:val="es-EC" w:eastAsia="ja-JP"/>
               </w:rPr>
-              <w:t>elación entre contenido adicional y popularidad</w:t>
+            </w:pPr>
+            <w:r>
+              <w:rPr>
+                <w:rFonts w:eastAsia="Times New Roman" w:cstheme="minorHAnsi"/>
+                <w:lang w:val="es-EC" w:eastAsia="ja-JP"/>
+              </w:rPr>
+              <w:t>category_count</w:t>
+            </w:r>
+          </w:p>
+        </w:tc>
+        <w:tc>
+          <w:tcPr>
+            <w:tcW w:w="0" w:type="auto"/>
+          </w:tcPr>
+          <w:p>
+            <w:pPr>
+              <w:spacing w:after="0" w:line="240" w:lineRule="auto"/>
+              <w:rPr>
+                <w:rFonts w:eastAsia="Times New Roman" w:cstheme="minorHAnsi"/>
+                <w:lang w:val="es-EC" w:eastAsia="ja-JP"/>
+              </w:rPr>
+            </w:pPr>
+            <w:r>
+              <w:rPr>
+                <w:rFonts w:eastAsia="Times New Roman" w:cstheme="minorHAnsi"/>
+                <w:lang w:val="es-EC" w:eastAsia="ja-JP"/>
+              </w:rPr>
+              <w:t>Cantidad total de caracteristicas tecnicas y modos de juego del software</w:t>
+            </w:r>
+          </w:p>
+        </w:tc>
+        <w:tc>
+          <w:tcPr>
+            <w:tcW w:w="0" w:type="auto"/>
+          </w:tcPr>
+          <w:p>
+            <w:pPr>
+              <w:spacing w:after="0" w:line="240" w:lineRule="auto"/>
+              <w:rPr>
+                <w:rFonts w:eastAsia="Times New Roman" w:cstheme="minorHAnsi"/>
+                <w:lang w:val="es-EC" w:eastAsia="ja-JP"/>
+              </w:rPr>
+            </w:pPr>
+            <w:r>
+              <w:rPr>
+                <w:rFonts w:eastAsia="Times New Roman" w:cstheme="minorHAnsi"/>
+                <w:lang w:val="es-EC" w:eastAsia="ja-JP"/>
+              </w:rPr>
+              <w:t>Variable independiente eje X para evaluar la complejidad del producto</w:t>
+            </w:r>
+          </w:p>
+        </w:tc>
+      </w:tr>
+      <w:tr>
+        <w:trPr/>
+        <w:tc>
+          <w:tcPr>
+            <w:tcW w:w="0" w:type="auto"/>
+          </w:tcPr>
+          <w:p>
+            <w:pPr>
+              <w:spacing w:after="0" w:line="240" w:lineRule="auto"/>
+              <w:rPr>
+                <w:rFonts w:eastAsia="Times New Roman" w:cstheme="minorHAnsi"/>
+                <w:lang w:val="es-EC" w:eastAsia="ja-JP"/>
+              </w:rPr>
+            </w:pPr>
+            <w:r>
+              <w:rPr>
+                <w:rFonts w:eastAsia="Times New Roman" w:cstheme="minorHAnsi"/>
+                <w:lang w:val="es-EC" w:eastAsia="ja-JP"/>
+              </w:rPr>
+              <w:t>release_year</w:t>
+            </w:r>
+          </w:p>
+        </w:tc>
+        <w:tc>
+          <w:tcPr>
+            <w:tcW w:w="0" w:type="auto"/>
+          </w:tcPr>
+          <w:p>
+            <w:pPr>
+              <w:spacing w:after="0" w:line="240" w:lineRule="auto"/>
+              <w:rPr>
+                <w:rFonts w:eastAsia="Times New Roman" w:cstheme="minorHAnsi"/>
+                <w:lang w:val="es-EC" w:eastAsia="ja-JP"/>
+              </w:rPr>
+            </w:pPr>
+            <w:r>
+              <w:rPr>
+                <w:rFonts w:eastAsia="Times New Roman" w:cstheme="minorHAnsi"/>
+                <w:lang w:val="es-EC" w:eastAsia="ja-JP"/>
+              </w:rPr>
+              <w:t>Ano de lanzamiento extraido de la fecha oficial de publicacion</w:t>
+            </w:r>
+          </w:p>
+        </w:tc>
+        <w:tc>
+          <w:tcPr>
+            <w:tcW w:w="0" w:type="auto"/>
+          </w:tcPr>
+          <w:p>
+            <w:pPr>
+              <w:spacing w:after="0" w:line="240" w:lineRule="auto"/>
+              <w:rPr>
+                <w:rFonts w:eastAsia="Times New Roman" w:cstheme="minorHAnsi"/>
+                <w:lang w:val="es-EC" w:eastAsia="ja-JP"/>
+              </w:rPr>
+            </w:pPr>
+            <w:r>
+              <w:rPr>
+                <w:rFonts w:eastAsia="Times New Roman" w:cstheme="minorHAnsi"/>
+                <w:lang w:val="es-EC" w:eastAsia="ja-JP"/>
+              </w:rPr>
+              <w:t>Variable independiente eje X para evaluar la antiguedad y vigencia en el mercado</w:t>
             </w:r>
           </w:p>
         </w:tc>

</xml_diff>